<commit_message>
Default to Anthropic with demo reflections and receipt favicon
</commit_message>
<xml_diff>
--- a/docs/AI-receipt-calculations.docx
+++ b/docs/AI-receipt-calculations.docx
@@ -2587,7 +2587,7 @@
     </w:p>
     <w:p>
       <w:r>
-        <w:t>An action count is the number of unique calls grouped into search/retrieve, write/edit files, run commands, browser/interface, ask/clarify, plan/coordinate, discover tools, present results or other tools. Codex exec expressions identify attempted nested calls; a failed or conditional invocation is not proof of success.</w:t>
+        <w:t>The Total number row sums unique tool calls; associated token and cost columns are not summed because they overlap. An action count is the number of unique calls grouped into search/retrieve, write/edit files, run commands, browser/interface, ask/clarify, plan/coordinate, discover tools, present results or other tools. Codex exec expressions identify attempted nested calls; a failed or conditional invocation is not proof of success.</w:t>
       </w:r>
     </w:p>
     <w:p>
@@ -2610,7 +2610,7 @@
     </w:p>
     <w:p>
       <w:r>
-        <w:t>The interface asks three questions: was the result useful, what moved forward, and what happened to the output. We use them to calculate a reflection gain score. The word gain refers to reported usefulness and progress; it does not mean financial profit or causal business improvement.</w:t>
+        <w:t>The interface asks three questions: was the result useful, what moved forward, and what happened to the AI output. We use them to calculate a reflection gain score. The word gain refers to reported usefulness and progress; it does not mean financial profit or causal business improvement.</w:t>
       </w:r>
     </w:p>
     <w:p>
@@ -3122,6 +3122,73 @@
           </w:p>
         </w:tc>
       </w:tr>
+      <w:tr>
+        <w:tc>
+          <w:tcPr>
+            <w:tcW w:type="dxa" w:w="6912"/>
+            <w:vAlign w:val="center"/>
+            <w:tcBorders>
+              <w:top w:val="single" w:sz="4" w:color="D9D9D9"/>
+              <w:left w:val="single" w:sz="4" w:color="D9D9D9"/>
+              <w:bottom w:val="single" w:sz="4" w:color="D9D9D9"/>
+              <w:right w:val="single" w:sz="4" w:color="D9D9D9"/>
+            </w:tcBorders>
+            <w:tcMar>
+              <w:top w:w="80" w:type="dxa"/>
+              <w:left w:w="80" w:type="dxa"/>
+              <w:bottom w:w="80" w:type="dxa"/>
+              <w:right w:w="80" w:type="dxa"/>
+            </w:tcMar>
+            <w:shd w:fill="FFFFFF"/>
+          </w:tcPr>
+          <w:p>
+            <w:pPr>
+              <w:spacing w:after="0" w:line="252" w:lineRule="auto"/>
+            </w:pPr>
+            <w:r>
+              <w:rPr>
+                <w:b w:val="0"/>
+                <w:color w:val="000000"/>
+                <w:sz w:val="20"/>
+              </w:rPr>
+              <w:t>Nothing moved forward</w:t>
+            </w:r>
+          </w:p>
+        </w:tc>
+        <w:tc>
+          <w:tcPr>
+            <w:tcW w:type="dxa" w:w="2448"/>
+            <w:vAlign w:val="center"/>
+            <w:tcBorders>
+              <w:top w:val="single" w:sz="4" w:color="D9D9D9"/>
+              <w:left w:val="single" w:sz="4" w:color="D9D9D9"/>
+              <w:bottom w:val="single" w:sz="4" w:color="D9D9D9"/>
+              <w:right w:val="single" w:sz="4" w:color="D9D9D9"/>
+            </w:tcBorders>
+            <w:tcMar>
+              <w:top w:w="80" w:type="dxa"/>
+              <w:left w:w="80" w:type="dxa"/>
+              <w:bottom w:w="80" w:type="dxa"/>
+              <w:right w:w="80" w:type="dxa"/>
+            </w:tcMar>
+            <w:shd w:fill="FFFFFF"/>
+          </w:tcPr>
+          <w:p>
+            <w:pPr>
+              <w:spacing w:after="0" w:line="252" w:lineRule="auto"/>
+              <w:jc w:val="center"/>
+            </w:pPr>
+            <w:r>
+              <w:rPr>
+                <w:b w:val="0"/>
+                <w:color w:val="000000"/>
+                <w:sz w:val="20"/>
+              </w:rPr>
+              <w:t>0.0</w:t>
+            </w:r>
+          </w:p>
+        </w:tc>
+      </w:tr>
     </w:tbl>
     <w:p/>
     <w:tbl>
@@ -3502,7 +3569,7 @@
                 <w:color w:val="000000"/>
                 <w:sz w:val="20"/>
               </w:rPr>
-              <w:t>Abandoned</w:t>
+              <w:t>Lost or abandoned</w:t>
             </w:r>
           </w:p>
         </w:tc>
@@ -3544,7 +3611,7 @@
     <w:p/>
     <w:p>
       <w:r>
-        <w:t>These category and status weights are transparent prototype choices, not empirical findings or proof that decisions are intrinsically more valuable than errands. They should be validated or revised with users. Under the current complete-response options, possible scores run from 20% to 100%. An abandoned output can still score above zero when the user reports useful learning or progress.</w:t>
+        <w:t>These category and status weights are transparent prototype choices, not empirical findings or proof that decisions are intrinsically more valuable than errands. They should be validated or revised with users. Under the current complete-response options, possible scores run from 10% to 100%. An abandoned output can still score above zero when the user reports useful learning or progress.</w:t>
       </w:r>
     </w:p>
     <w:p>

</xml_diff>